<commit_message>
Point booking buttons to the breakthrough Calendly event
Co-Authored-By: Claude Opus 5.5 <noreply@anthropic.com>
Claude-Session: https://claude.ai/code/session_01QtsEaUnHz7gtTApzgSGYm3
</commit_message>
<xml_diff>
--- a/your-next-step/Your Next Step systeme.io Copy.docx
+++ b/your-next-step/Your Next Step systeme.io Copy.docx
@@ -42,10 +42,10 @@
         <w:rPr>
           <w:b/>
         </w:rPr>
-        <w:t xml:space="preserve">Confirm the Calendly event length. </w:t>
+        <w:t xml:space="preserve">Confirm the Calendly event matches this page. </w:t>
       </w:r>
       <w:r>
-        <w:t>The booking link is your 30min event, and this page sells a 60-minute session. Create or link a 60 minute event, or the page and the booking page will disagree.</w:t>
+        <w:t>The booking link is your breakthrough event. Set its length to 60 minutes and rename it Your Next Step so the booking page uses the same name as this page.</w:t>
       </w:r>
     </w:p>
     <w:p>
@@ -126,7 +126,7 @@
         <w:t xml:space="preserve">Buttons: </w:t>
       </w:r>
       <w:r>
-        <w:t>every Book Your Next Step button links to https://calendly.com/nechellemarie/30min. Use full width buttons on mobile, at least 56px tall, fully rounded corners.</w:t>
+        <w:t>every Book Your Next Step button links to https://calendly.com/nechellemarie/breakthrough. Use full width buttons on mobile, at least 56px tall, fully rounded corners.</w:t>
       </w:r>
     </w:p>
     <w:p>
@@ -335,7 +335,7 @@
         <w:t xml:space="preserve">Button: </w:t>
       </w:r>
       <w:r>
-        <w:t>Book Your Next Step  (links to https://calendly.com/nechellemarie/30min)</w:t>
+        <w:t>Book Your Next Step  (links to https://calendly.com/nechellemarie/breakthrough)</w:t>
       </w:r>
     </w:p>
     <w:p>
@@ -616,7 +616,7 @@
         <w:t xml:space="preserve">Button: </w:t>
       </w:r>
       <w:r>
-        <w:t>Book Your Next Step  (links to https://calendly.com/nechellemarie/30min)</w:t>
+        <w:t>Book Your Next Step  (links to https://calendly.com/nechellemarie/breakthrough)</w:t>
       </w:r>
     </w:p>
     <w:p>
@@ -1036,7 +1036,7 @@
         <w:t xml:space="preserve">Button: </w:t>
       </w:r>
       <w:r>
-        <w:t>Book Your Next Step  (links to https://calendly.com/nechellemarie/30min; white button, plum text)</w:t>
+        <w:t>Book Your Next Step  (links to https://calendly.com/nechellemarie/breakthrough; white button, plum text)</w:t>
       </w:r>
     </w:p>
     <w:p>

</xml_diff>

<commit_message>
Add Privacy Policy and Terms pages, Zoom session detail
Co-Authored-By: Claude Opus 5.5 <noreply@anthropic.com>
Claude-Session: https://claude.ai/code/session_01QtsEaUnHz7gtTApzgSGYm3
</commit_message>
<xml_diff>
--- a/your-next-step/Your Next Step systeme.io Copy.docx
+++ b/your-next-step/Your Next Step systeme.io Copy.docx
@@ -56,24 +56,10 @@
         <w:rPr>
           <w:b/>
         </w:rPr>
-        <w:t xml:space="preserve">Confirm pricing shows on Calendly. </w:t>
+        <w:t xml:space="preserve">Link the footer </w:t>
       </w:r>
       <w:r>
-        <w:t>The closing section says pricing and payment details appear on the booking page before payment. Connect Stripe or PayPal to that Calendly event, or ask for that line to be changed.</w:t>
-      </w:r>
-    </w:p>
-    <w:p>
-      <w:pPr>
-        <w:pStyle w:val="ListNumber"/>
-      </w:pPr>
-      <w:r>
-        <w:rPr>
-          <w:b/>
-        </w:rPr>
-        <w:t xml:space="preserve">Add your Privacy Policy and Terms links </w:t>
-      </w:r>
-      <w:r>
-        <w:t>to the footer.</w:t>
+        <w:t>Privacy Policy and Terms links to the two legal pages (see the Privacy Policy and Terms copy doc).</w:t>
       </w:r>
     </w:p>
     <w:p>
@@ -496,7 +482,7 @@
           <w:b w:val="0"/>
           <w:i w:val="0"/>
         </w:rPr>
-        <w:t>Your Next Step is a 60-minute, one-on-one coaching session. It’s focused time to sort through what’s on your mind and decide what comes next.</w:t>
+        <w:t>Your Next Step is a 60-minute, one-on-one coaching session on Zoom. It’s focused time to sort through what’s on your mind and decide what comes next.</w:t>
       </w:r>
     </w:p>
     <w:p>
@@ -1094,7 +1080,7 @@
           <w:b w:val="0"/>
           <w:i w:val="0"/>
         </w:rPr>
-        <w:t>Links: Privacy Policy [INSERT PRIVACY POLICY LINK]  |  Terms [INSERT TERMS LINK]  |  Contact (nechelle@iamnechellemarie.com)</w:t>
+        <w:t>Links: Privacy Policy (your /privacy-policy page)  |  Terms (your /terms page)  |  Contact (nechelle@iamnechellemarie.com)</w:t>
       </w:r>
     </w:p>
     <w:sectPr>

</xml_diff>

<commit_message>
Switch brand colors to crimson #95111e and dusty rose #c8a29e
Co-Authored-By: Claude Opus 5.5 <noreply@anthropic.com>
Claude-Session: https://claude.ai/code/session_01QtsEaUnHz7gtTApzgSGYm3
</commit_message>
<xml_diff>
--- a/your-next-step/Your Next Step systeme.io Copy.docx
+++ b/your-next-step/Your Next Step systeme.io Copy.docx
@@ -126,7 +126,7 @@
         <w:t xml:space="preserve">Colors: </w:t>
       </w:r>
       <w:r>
-        <w:t>buttons and accents deep plum #4E1D48 with white text; headline and body text #2B1E29; secondary text #5D4D58; small uppercase labels #9C6A8F. Backgrounds alternate linen #F8F3EE and sand #EFE5DB; cards white #FFFCF9 with a #DCCFC3 border. The closing section uses a plum #4E1D48 background, white text, and a white button with plum text.</w:t>
+        <w:t>buttons and accents crimson #95111e with white text; small uppercase labels crimson #95111e; decorative lines, list markers, and soft highlights dusty rose #c8a29e (or its light tint #F0E1DE behind text). Headline and body text #2A1C1D; secondary text #5E4A4B. Backgrounds alternate linen #F8F3EE and sand #EFE5DB; cards white #FFFCF9 with a #E2D2CE border. The closing section uses a crimson #95111e background, white text, and a white button with crimson text. Never use dusty rose for text: it is too light to read on linen.</w:t>
       </w:r>
     </w:p>
     <w:p>
@@ -582,7 +582,7 @@
           <w:i/>
           <w:color w:val="5D4D58"/>
         </w:rPr>
-        <w:t>Highlighted box:</w:t>
+        <w:t>Highlighted box (light dusty rose tint):</w:t>
       </w:r>
     </w:p>
     <w:p>
@@ -748,7 +748,7 @@
           <w:i/>
           <w:color w:val="5D4D58"/>
         </w:rPr>
-        <w:t>Optional under the third card: a row of seven small boxes labeled Day 1, 2, 3, 4, 5, 6, 7, with Day 1 in plum.</w:t>
+        <w:t>Optional under the third card: a row of seven small boxes labeled Day 1, 2, 3, 4, 5, 6, 7, with Day 1 in crimson.</w:t>
       </w:r>
     </w:p>
     <w:p>
@@ -1000,7 +1000,7 @@
           <w:i/>
           <w:color w:val="5D4D58"/>
         </w:rPr>
-        <w:t>Plum background, white text.</w:t>
+        <w:t>Crimson background, white text.</w:t>
       </w:r>
     </w:p>
     <w:p>
@@ -1022,7 +1022,7 @@
         <w:t xml:space="preserve">Button: </w:t>
       </w:r>
       <w:r>
-        <w:t>Book Your Next Step  (links to https://calendly.com/nechellemarie/your_next_steps; white button, plum text)</w:t>
+        <w:t>Book Your Next Step  (links to https://calendly.com/nechellemarie/your_next_steps; white button, crimson text)</w:t>
       </w:r>
     </w:p>
     <w:p>

</xml_diff>

<commit_message>
Switch brand colors to mocha #7A5240 and blush #EBC4C0
Co-Authored-By: Claude Opus 5.5 <noreply@anthropic.com>
Claude-Session: https://claude.ai/code/session_01QtsEaUnHz7gtTApzgSGYm3
</commit_message>
<xml_diff>
--- a/your-next-step/Your Next Step systeme.io Copy.docx
+++ b/your-next-step/Your Next Step systeme.io Copy.docx
@@ -126,7 +126,7 @@
         <w:t xml:space="preserve">Colors: </w:t>
       </w:r>
       <w:r>
-        <w:t>buttons and accents crimson #95111e with white text; small uppercase labels crimson #95111e; decorative lines, list markers, and soft highlights dusty rose #c8a29e (or its light tint #F0E1DE behind text). Headline and body text #2A1C1D; secondary text #5E4A4B. Backgrounds alternate linen #F8F3EE and sand #EFE5DB; cards white #FFFCF9 with a #E2D2CE border. The closing section uses a crimson #95111e background, white text, and a white button with crimson text. Never use dusty rose for text: it is too light to read on linen.</w:t>
+        <w:t>buttons and accents mocha brown #7A5240 with white text; small uppercase labels mocha brown #7A5240; decorative lines, list markers, and soft highlights blush pink #EBC4C0 (or its light tint #F6E6E3 behind text). Headline and body text #2B201B; secondary text #5E4B42. Backgrounds alternate linen #F8F3EE and sand #EFE5DB; cards white #FFFCF9 with a #E6D6CF border. The closing section uses a mocha #7A5240 background, white text, and a white button with mocha text. Never use blush pink for text: it is too light to read on linen.</w:t>
       </w:r>
     </w:p>
     <w:p>
@@ -582,7 +582,7 @@
           <w:i/>
           <w:color w:val="5D4D58"/>
         </w:rPr>
-        <w:t>Highlighted box (light dusty rose tint):</w:t>
+        <w:t>Highlighted box (light blush tint):</w:t>
       </w:r>
     </w:p>
     <w:p>
@@ -748,7 +748,7 @@
           <w:i/>
           <w:color w:val="5D4D58"/>
         </w:rPr>
-        <w:t>Optional under the third card: a row of seven small boxes labeled Day 1, 2, 3, 4, 5, 6, 7, with Day 1 in crimson.</w:t>
+        <w:t>Optional under the third card: a row of seven small boxes labeled Day 1, 2, 3, 4, 5, 6, 7, with Day 1 in mocha brown.</w:t>
       </w:r>
     </w:p>
     <w:p>
@@ -1000,7 +1000,7 @@
           <w:i/>
           <w:color w:val="5D4D58"/>
         </w:rPr>
-        <w:t>Crimson background, white text.</w:t>
+        <w:t>Mocha brown background, white text.</w:t>
       </w:r>
     </w:p>
     <w:p>
@@ -1022,7 +1022,7 @@
         <w:t xml:space="preserve">Button: </w:t>
       </w:r>
       <w:r>
-        <w:t>Book Your Next Step  (links to https://calendly.com/nechellemarie/your_next_steps; white button, crimson text)</w:t>
+        <w:t>Book Your Next Step  (links to https://calendly.com/nechellemarie/your_next_steps; white button, mocha text)</w:t>
       </w:r>
     </w:p>
     <w:p>

</xml_diff>

<commit_message>
Match site colors: espresso, deep gold, warm cream
Co-Authored-By: Claude Opus 5.5 <noreply@anthropic.com>
Claude-Session: https://claude.ai/code/session_01QtsEaUnHz7gtTApzgSGYm3
</commit_message>
<xml_diff>
--- a/your-next-step/Your Next Step systeme.io Copy.docx
+++ b/your-next-step/Your Next Step systeme.io Copy.docx
@@ -126,7 +126,7 @@
         <w:t xml:space="preserve">Colors: </w:t>
       </w:r>
       <w:r>
-        <w:t>buttons and accents light mocha #96644C with white text; small uppercase labels in a deeper mocha #7A5240 so they stay readable; decorative lines, list markers, and soft highlights blush pink #EBC4C0 (or its light tint #F6E6E3 behind text). Headline and body text #2B201B; secondary text #5E4B42. Backgrounds alternate linen #F8F3EE and sand #EFE5DB; cards white #FFFCF9 with a #E6D6CF border. The closing section uses a light mocha #96644C background, white text, and a white button with mocha text. Never use blush pink for text: it is too light to read on linen.</w:t>
+        <w:t>these match iamnechellemarie.com. Buttons deep gold #B5852F with espresso #2B2118 text (white text on gold is too faint to read). Headlines and body text espresso #2B2118; secondary text #5E5246; small uppercase labels, step numbers, and text links dark gold #7A5718. Gold is never used for headlines or body text: the headline accent is a gold underline, and quote borders, list markers, and highlights use gold or its light tint #F3E7CF. Backgrounds alternate warm cream #F7F2EA and #EFE6D8; cards white #FFFFFF with a #E3D8C6 border. The closing section uses a deep gold #B5852F background, espresso text, and an espresso button with gold text.</w:t>
       </w:r>
     </w:p>
     <w:p>
@@ -582,7 +582,7 @@
           <w:i/>
           <w:color w:val="5D4D58"/>
         </w:rPr>
-        <w:t>Highlighted box (light blush tint):</w:t>
+        <w:t>Highlighted box (light gold tint):</w:t>
       </w:r>
     </w:p>
     <w:p>
@@ -748,7 +748,7 @@
           <w:i/>
           <w:color w:val="5D4D58"/>
         </w:rPr>
-        <w:t>Optional under the third card: a row of seven small boxes labeled Day 1, 2, 3, 4, 5, 6, 7, with Day 1 in mocha brown.</w:t>
+        <w:t>Optional under the third card: a row of seven small boxes labeled Day 1, 2, 3, 4, 5, 6, 7, with Day 1 in deep gold.</w:t>
       </w:r>
     </w:p>
     <w:p>
@@ -1000,7 +1000,7 @@
           <w:i/>
           <w:color w:val="5D4D58"/>
         </w:rPr>
-        <w:t>Mocha brown background, white text.</w:t>
+        <w:t>Deep gold background, espresso text.</w:t>
       </w:r>
     </w:p>
     <w:p>
@@ -1022,7 +1022,7 @@
         <w:t xml:space="preserve">Button: </w:t>
       </w:r>
       <w:r>
-        <w:t>Book Your Next Step  (links to https://calendly.com/nechellemarie/your_next_steps; white button, mocha text)</w:t>
+        <w:t>Book Your Next Step  (links to https://calendly.com/nechellemarie/your_next_steps; espresso button, gold text)</w:t>
       </w:r>
     </w:p>
     <w:p>

</xml_diff>

<commit_message>
Match website palette: dusty rose, warm taupe, soft blush beige
Co-Authored-By: Claude Opus 5.5 <noreply@anthropic.com>
Claude-Session: https://claude.ai/code/session_01QtsEaUnHz7gtTApzgSGYm3
</commit_message>
<xml_diff>
--- a/your-next-step/Your Next Step systeme.io Copy.docx
+++ b/your-next-step/Your Next Step systeme.io Copy.docx
@@ -112,7 +112,7 @@
         <w:t xml:space="preserve">Buttons: </w:t>
       </w:r>
       <w:r>
-        <w:t>every Book Your Next Step button links to https://calendly.com/nechellemarie/your_next_steps. Use full width buttons on mobile, at least 56px tall, fully rounded corners.</w:t>
+        <w:t>every Book Your Next Step button links to https://calendly.com/nechellemarie/your_next_steps. Use full width buttons on mobile, at least 56px tall, fully rounded corners, white 19px bold text.</w:t>
       </w:r>
     </w:p>
     <w:p>
@@ -126,7 +126,7 @@
         <w:t xml:space="preserve">Colors: </w:t>
       </w:r>
       <w:r>
-        <w:t>these match iamnechellemarie.com. Buttons deep gold #B5852F with espresso #2B2118 text (white text on gold is too faint to read). Headlines and body text espresso #2B2118; secondary text #5E5246; small uppercase labels, step numbers, and text links dark gold #7A5718. Gold is never used for headlines or body text: the headline accent is a gold underline, and quote borders, list markers, and highlights use gold or its light tint #F3E7CF. Backgrounds alternate warm cream #F7F2EA and #EFE6D8; cards white #FFFFFF with a #E3D8C6 border. The closing section uses a deep gold #B5852F background, espresso text, and an espresso button with gold text.</w:t>
+        <w:t>these match iamnechellemarie.com. Main background, header, and footer dusty rose #C8A29E. Alternating sections and highlight boxes soft blush beige #D4B8B0. Headings and body text near black #0E0E0E; secondary text #3A2E2B. Primary buttons warm taupe #8F7166 with white #FFFFFF text at 19px bold (smaller white text on taupe is hard to read). Cards and the closing section white #FFFFFF. Borders #B8928D.</w:t>
       </w:r>
     </w:p>
     <w:p>
@@ -582,7 +582,7 @@
           <w:i/>
           <w:color w:val="5D4D58"/>
         </w:rPr>
-        <w:t>Highlighted box (light gold tint):</w:t>
+        <w:t>Highlighted box (soft blush beige):</w:t>
       </w:r>
     </w:p>
     <w:p>
@@ -748,7 +748,7 @@
           <w:i/>
           <w:color w:val="5D4D58"/>
         </w:rPr>
-        <w:t>Optional under the third card: a row of seven small boxes labeled Day 1, 2, 3, 4, 5, 6, 7, with Day 1 in deep gold.</w:t>
+        <w:t>Optional under the third card: a row of seven small boxes labeled Day 1, 2, 3, 4, 5, 6, 7, with Day 1 in near black.</w:t>
       </w:r>
     </w:p>
     <w:p>
@@ -1000,7 +1000,7 @@
           <w:i/>
           <w:color w:val="5D4D58"/>
         </w:rPr>
-        <w:t>Deep gold background, espresso text.</w:t>
+        <w:t>White background, near black text.</w:t>
       </w:r>
     </w:p>
     <w:p>
@@ -1022,7 +1022,7 @@
         <w:t xml:space="preserve">Button: </w:t>
       </w:r>
       <w:r>
-        <w:t>Book Your Next Step  (links to https://calendly.com/nechellemarie/your_next_steps; espresso button, gold text)</w:t>
+        <w:t>Book Your Next Step  (links to https://calendly.com/nechellemarie/your_next_steps; taupe button, white text)</w:t>
       </w:r>
     </w:p>
     <w:p>

</xml_diff>